<commit_message>
Update Bangla and English user manuals for features shipped since they were written
The manuals (written 2026-09-23) predated three features that shipped the
same day/after: Sales Receipts, the Company Settings page (Login Security,
IP Whitelist, Document Numbering, Email/SMTP, Payment Gateway tabs), and
Login History. Company Settings also absorbed the old standalone Period
Lock page, so its "Menu path" line in both manuals was stale.

Adds a Sales Receipts chapter to Part 6, a Company Settings chapter
replacing the old Period Lock-only one in Part 2 (documenting every tab),
a new Login History chapter, an account-lockout tip under Users, and three
FAQ entries plus a glossary term for Sales Receipt — mirrored in both
languages with identical structure and section numbering.

Co-Authored-By: Claude Sonnet 5 <noreply@anthropic.com>
</commit_message>
<xml_diff>
--- a/EasyAccountsERP_User_Manual_BN.docx
+++ b/EasyAccountsERP_User_Manual_BN.docx
@@ -1271,6 +1271,22 @@
     </w:p>
     <w:p>
       <w:pPr>
+        <w:pStyle w:val="ListParagraph"/>
+        <w:numPr>
+          <w:ilvl w:val="0"/>
+          <w:numId w:val="1"/>
+        </w:numPr>
+        <w:spacing w:after="60"/>
+      </w:pPr>
+      <w:r>
+        <w:rPr>
+          <w:rFonts w:ascii="Nirmala UI" w:cs="Nirmala UI" w:eastAsia="Nirmala UI" w:hAnsi="Nirmala UI"/>
+        </w:rPr>
+        <w:t xml:space="preserve">বারবার ভুল লগইন চেষ্টার কারণে কোনো অ্যাকাউন্ট লক হয়ে গেলে (দেখুন Company Settings-এর Login Security, ২.৩), একজন প্রশাসক সংশ্লিষ্ট ব্যবহারকারীর এডিট পেজ থেকে "Unlock Now" দিয়ে সাথে সাথে আনলক করে দিতে পারেন।</w:t>
+      </w:r>
+    </w:p>
+    <w:p>
+      <w:pPr>
         <w:pStyle w:val="Heading2"/>
         <w:spacing w:after="160" w:before="300"/>
       </w:pPr>
@@ -1573,7 +1589,7 @@
           <w:bCs/>
           <w:color w:val="1F4E79"/>
         </w:rPr>
-        <w:t xml:space="preserve">পিরিয়ড লক (Period Lock)</w:t>
+        <w:t xml:space="preserve">কোম্পানি সেটিংস (Company Settings)</w:t>
       </w:r>
     </w:p>
     <w:p>
@@ -1594,7 +1610,7 @@
           <w:rFonts w:ascii="Nirmala UI" w:cs="Nirmala UI" w:eastAsia="Nirmala UI" w:hAnsi="Nirmala UI"/>
           <w:color w:val="555555"/>
         </w:rPr>
-        <w:t xml:space="preserve">Accounting → Period Lock</w:t>
+        <w:t xml:space="preserve">Accounting → Company Settings</w:t>
       </w:r>
     </w:p>
     <w:p>
@@ -1636,7 +1652,7 @@
           <w:rFonts w:ascii="Nirmala UI" w:cs="Nirmala UI" w:eastAsia="Nirmala UI" w:hAnsi="Nirmala UI"/>
           <w:color w:val="555555"/>
         </w:rPr>
-        <w:t xml:space="preserve">চার্ট অব অ্যাকাউন্টস ও প্রাথমিক জার্নাল এন্ট্রি থাকা ভালো, তবে প্রযুক্তিগতভাবে যেকোনো সময় সেট করা যায়।</w:t>
+        <w:t xml:space="preserve">পেজটি খুলতে আলাদা কিছু লাগে না; তবে কিছু ট্যাব তখনই বেশি কাজে লাগবে যখন সংশ্লিষ্ট ডেটা থাকবে (যেমন Period Lock-এর আগে চার্ট অব অ্যাকাউন্টস, বা পেমেন্ট লিংক তৈরির আগে একটি পোস্ট করা ইনভয়েস)।</w:t>
       </w:r>
     </w:p>
     <w:p>
@@ -1651,7 +1667,7 @@
           <w:i w:val="false"/>
           <w:iCs w:val="false"/>
         </w:rPr>
-        <w:t xml:space="preserve">পিরিয়ড লক দিয়ে একটি নির্দিষ্ট তারিখ পর্যন্ত হিসাবরক্ষণের রেকর্ড "বন্ধ" (locked) করে রাখা যায়, যাতে অতীতের হিসাব ভুলবশত পরিবর্তন না হয়। এটি সাধারণত একটি অ্যাকাউন্টিং সময়কাল (যেমন একটি মাস বা অর্থবছর) চূড়ান্তভাবে বন্ধ করার পর ব্যবহার করা হয়।</w:t>
+        <w:t xml:space="preserve">এই একটি পেজেই প্রতিষ্ঠানের সব কনফিগারেশন সেটিং একসাথে রাখা হয়েছে, কয়েকটি ট্যাবে ভাগ করে — কোম্পানি লোগো, ই-মেইল (SMTP), পেমেন্ট গেটওয়ে, লগইন সিকিউরিটি, আইপি হোয়াইটলিস্ট, পিরিয়ড লক, এবং ডকুমেন্ট নম্বরিং। শুধু settings.view থাকলে দেখা যাবে, পরিবর্তন করে সংরক্ষণ করতে settings.manage প্রয়োজন।</w:t>
       </w:r>
     </w:p>
     <w:p>
@@ -1665,39 +1681,22 @@
           <w:b/>
           <w:bCs/>
         </w:rPr>
-        <w:t xml:space="preserve">ফর্মের ফিল্ডসমূহ</w:t>
-      </w:r>
-    </w:p>
-    <w:p>
-      <w:pPr>
-        <w:pStyle w:val="ListParagraph"/>
-        <w:numPr>
-          <w:ilvl w:val="0"/>
-          <w:numId w:val="1"/>
-        </w:numPr>
-        <w:spacing w:after="60"/>
-      </w:pPr>
-      <w:r>
-        <w:rPr>
-          <w:rFonts w:ascii="Nirmala UI" w:cs="Nirmala UI" w:eastAsia="Nirmala UI" w:hAnsi="Nirmala UI"/>
-        </w:rPr>
-        <w:t xml:space="preserve">লকড থ্রু তারিখ (Locked Through Date) — এই তারিখ পর্যন্ত সব লেনদেন লক থাকবে</w:t>
-      </w:r>
-    </w:p>
-    <w:p>
-      <w:pPr>
-        <w:pStyle w:val="ListParagraph"/>
-        <w:numPr>
-          <w:ilvl w:val="0"/>
-          <w:numId w:val="1"/>
-        </w:numPr>
-        <w:spacing w:after="60"/>
-      </w:pPr>
-      <w:r>
-        <w:rPr>
-          <w:rFonts w:ascii="Nirmala UI" w:cs="Nirmala UI" w:eastAsia="Nirmala UI" w:hAnsi="Nirmala UI"/>
-        </w:rPr>
-        <w:t xml:space="preserve">বর্তমান লক অবস্থার স্ট্যাটাস ব্যানার (শুধু তথ্যের জন্য)</w:t>
+        <w:t xml:space="preserve">কোম্পানি লোগো</w:t>
+      </w:r>
+    </w:p>
+    <w:p>
+      <w:pPr>
+        <w:spacing w:after="120"/>
+      </w:pPr>
+      <w:r>
+        <w:rPr>
+          <w:rFonts w:ascii="Nirmala UI" w:cs="Nirmala UI" w:eastAsia="Nirmala UI" w:hAnsi="Nirmala UI"/>
+          <w:b w:val="false"/>
+          <w:bCs w:val="false"/>
+          <w:i w:val="false"/>
+          <w:iCs w:val="false"/>
+        </w:rPr>
+        <w:t xml:space="preserve">ইনভয়েস, এস্টিমেট ও অন্যান্য পিডিএফ ডকুমেন্টে যে লোগো দেখা যায়, তা এখান থেকেই আপলোড করা হয় (PNG/JPG)। মুছে ফেলতে "Remove" ব্যবহার করুন।</w:t>
       </w:r>
     </w:p>
     <w:p>
@@ -1711,71 +1710,22 @@
           <w:b/>
           <w:bCs/>
         </w:rPr>
-        <w:t xml:space="preserve">ধাপে ধাপে ব্যবহার পদ্ধতি</w:t>
-      </w:r>
-    </w:p>
-    <w:p>
-      <w:pPr>
-        <w:pStyle w:val="ListParagraph"/>
-        <w:numPr>
-          <w:ilvl w:val="0"/>
-          <w:numId w:val="2"/>
-        </w:numPr>
-        <w:spacing w:after="70"/>
-      </w:pPr>
-      <w:r>
-        <w:rPr>
-          <w:rFonts w:ascii="Nirmala UI" w:cs="Nirmala UI" w:eastAsia="Nirmala UI" w:hAnsi="Nirmala UI"/>
-        </w:rPr>
-        <w:t xml:space="preserve">Accounting → Period Lock পেজে যান।</w:t>
-      </w:r>
-    </w:p>
-    <w:p>
-      <w:pPr>
-        <w:pStyle w:val="ListParagraph"/>
-        <w:numPr>
-          <w:ilvl w:val="0"/>
-          <w:numId w:val="2"/>
-        </w:numPr>
-        <w:spacing w:after="70"/>
-      </w:pPr>
-      <w:r>
-        <w:rPr>
-          <w:rFonts w:ascii="Nirmala UI" w:cs="Nirmala UI" w:eastAsia="Nirmala UI" w:hAnsi="Nirmala UI"/>
-        </w:rPr>
-        <w:t xml:space="preserve">যে তারিখ পর্যন্ত হিসাব লক করতে চান, সেটি নির্বাচন করুন।</w:t>
-      </w:r>
-    </w:p>
-    <w:p>
-      <w:pPr>
-        <w:pStyle w:val="ListParagraph"/>
-        <w:numPr>
-          <w:ilvl w:val="0"/>
-          <w:numId w:val="2"/>
-        </w:numPr>
-        <w:spacing w:after="70"/>
-      </w:pPr>
-      <w:r>
-        <w:rPr>
-          <w:rFonts w:ascii="Nirmala UI" w:cs="Nirmala UI" w:eastAsia="Nirmala UI" w:hAnsi="Nirmala UI"/>
-        </w:rPr>
-        <w:t xml:space="preserve">সংরক্ষণ করুন — এখন থেকে ওই তারিখ বা তার আগের কোনো নতুন/সংশোধিত জার্নাল এন্ট্রি গ্রহণ করা হবে না।</w:t>
-      </w:r>
-    </w:p>
-    <w:p>
-      <w:pPr>
-        <w:pStyle w:val="ListParagraph"/>
-        <w:numPr>
-          <w:ilvl w:val="0"/>
-          <w:numId w:val="2"/>
-        </w:numPr>
-        <w:spacing w:after="70"/>
-      </w:pPr>
-      <w:r>
-        <w:rPr>
-          <w:rFonts w:ascii="Nirmala UI" w:cs="Nirmala UI" w:eastAsia="Nirmala UI" w:hAnsi="Nirmala UI"/>
-        </w:rPr>
-        <w:t xml:space="preserve">লক তুলে নিতে হলে "Remove Lock" বাটন ব্যবহার করুন (শুধু settings.manage পারমিশনধারীরা করতে পারবেন)।</w:t>
+        <w:t xml:space="preserve">ই-মেইল (SMTP)</w:t>
+      </w:r>
+    </w:p>
+    <w:p>
+      <w:pPr>
+        <w:spacing w:after="120"/>
+      </w:pPr>
+      <w:r>
+        <w:rPr>
+          <w:rFonts w:ascii="Nirmala UI" w:cs="Nirmala UI" w:eastAsia="Nirmala UI" w:hAnsi="Nirmala UI"/>
+          <w:b w:val="false"/>
+          <w:bCs w:val="false"/>
+          <w:i w:val="false"/>
+          <w:iCs w:val="false"/>
+        </w:rPr>
+        <w:t xml:space="preserve">ইনভয়েস ই-মেইল, মেয়াদোত্তীর্ণ রিমাইন্ডার ও অন্যান্য সিস্টেম নোটিফিকেশন এখানে কনফিগার করা SMTP সার্ভার দিয়েই পাঠানো হয়।</w:t>
       </w:r>
     </w:p>
     <w:p>
@@ -1789,6 +1739,226 @@
           <w:b/>
           <w:bCs/>
         </w:rPr>
+        <w:t xml:space="preserve">ফর্মের ফিল্ডসমূহ</w:t>
+      </w:r>
+    </w:p>
+    <w:p>
+      <w:pPr>
+        <w:pStyle w:val="ListParagraph"/>
+        <w:numPr>
+          <w:ilvl w:val="0"/>
+          <w:numId w:val="1"/>
+        </w:numPr>
+        <w:spacing w:after="60"/>
+      </w:pPr>
+      <w:r>
+        <w:rPr>
+          <w:rFonts w:ascii="Nirmala UI" w:cs="Nirmala UI" w:eastAsia="Nirmala UI" w:hAnsi="Nirmala UI"/>
+        </w:rPr>
+        <w:t xml:space="preserve">SMTP হোস্ট (আবশ্যক)</w:t>
+      </w:r>
+    </w:p>
+    <w:p>
+      <w:pPr>
+        <w:pStyle w:val="ListParagraph"/>
+        <w:numPr>
+          <w:ilvl w:val="0"/>
+          <w:numId w:val="1"/>
+        </w:numPr>
+        <w:spacing w:after="60"/>
+      </w:pPr>
+      <w:r>
+        <w:rPr>
+          <w:rFonts w:ascii="Nirmala UI" w:cs="Nirmala UI" w:eastAsia="Nirmala UI" w:hAnsi="Nirmala UI"/>
+        </w:rPr>
+        <w:t xml:space="preserve">SMTP পোর্ট (আবশ্যক)</w:t>
+      </w:r>
+    </w:p>
+    <w:p>
+      <w:pPr>
+        <w:pStyle w:val="ListParagraph"/>
+        <w:numPr>
+          <w:ilvl w:val="0"/>
+          <w:numId w:val="1"/>
+        </w:numPr>
+        <w:spacing w:after="60"/>
+      </w:pPr>
+      <w:r>
+        <w:rPr>
+          <w:rFonts w:ascii="Nirmala UI" w:cs="Nirmala UI" w:eastAsia="Nirmala UI" w:hAnsi="Nirmala UI"/>
+        </w:rPr>
+        <w:t xml:space="preserve">ইউজারনেম (ঐচ্ছিক)</w:t>
+      </w:r>
+    </w:p>
+    <w:p>
+      <w:pPr>
+        <w:pStyle w:val="ListParagraph"/>
+        <w:numPr>
+          <w:ilvl w:val="0"/>
+          <w:numId w:val="1"/>
+        </w:numPr>
+        <w:spacing w:after="60"/>
+      </w:pPr>
+      <w:r>
+        <w:rPr>
+          <w:rFonts w:ascii="Nirmala UI" w:cs="Nirmala UI" w:eastAsia="Nirmala UI" w:hAnsi="Nirmala UI"/>
+        </w:rPr>
+        <w:t xml:space="preserve">পাসওয়ার্ড (ঐচ্ছিক — এডিটের সময় খালি রাখলে আগের সংরক্ষিত পাসওয়ার্ডই থেকে যাবে)</w:t>
+      </w:r>
+    </w:p>
+    <w:p>
+      <w:pPr>
+        <w:pStyle w:val="ListParagraph"/>
+        <w:numPr>
+          <w:ilvl w:val="0"/>
+          <w:numId w:val="1"/>
+        </w:numPr>
+        <w:spacing w:after="60"/>
+      </w:pPr>
+      <w:r>
+        <w:rPr>
+          <w:rFonts w:ascii="Nirmala UI" w:cs="Nirmala UI" w:eastAsia="Nirmala UI" w:hAnsi="Nirmala UI"/>
+        </w:rPr>
+        <w:t xml:space="preserve">এনক্রিপশন — TLS বা SSL (ঐচ্ছিক)</w:t>
+      </w:r>
+    </w:p>
+    <w:p>
+      <w:pPr>
+        <w:pStyle w:val="ListParagraph"/>
+        <w:numPr>
+          <w:ilvl w:val="0"/>
+          <w:numId w:val="1"/>
+        </w:numPr>
+        <w:spacing w:after="60"/>
+      </w:pPr>
+      <w:r>
+        <w:rPr>
+          <w:rFonts w:ascii="Nirmala UI" w:cs="Nirmala UI" w:eastAsia="Nirmala UI" w:hAnsi="Nirmala UI"/>
+        </w:rPr>
+        <w:t xml:space="preserve">ফ্রম অ্যাড্রেস (আবশ্যক, প্রেরকের ই-মেইল)</w:t>
+      </w:r>
+    </w:p>
+    <w:p>
+      <w:pPr>
+        <w:pStyle w:val="ListParagraph"/>
+        <w:numPr>
+          <w:ilvl w:val="0"/>
+          <w:numId w:val="1"/>
+        </w:numPr>
+        <w:spacing w:after="60"/>
+      </w:pPr>
+      <w:r>
+        <w:rPr>
+          <w:rFonts w:ascii="Nirmala UI" w:cs="Nirmala UI" w:eastAsia="Nirmala UI" w:hAnsi="Nirmala UI"/>
+        </w:rPr>
+        <w:t xml:space="preserve">ফ্রম নাম (ঐচ্ছিক)</w:t>
+      </w:r>
+    </w:p>
+    <w:p>
+      <w:pPr>
+        <w:pStyle w:val="Heading3"/>
+        <w:spacing w:after="100" w:before="200"/>
+      </w:pPr>
+      <w:r>
+        <w:rPr>
+          <w:rFonts w:ascii="Nirmala UI" w:cs="Nirmala UI" w:eastAsia="Nirmala UI" w:hAnsi="Nirmala UI"/>
+          <w:b/>
+          <w:bCs/>
+        </w:rPr>
+        <w:t xml:space="preserve">ধাপে ধাপে ব্যবহার পদ্ধতি</w:t>
+      </w:r>
+    </w:p>
+    <w:p>
+      <w:pPr>
+        <w:pStyle w:val="ListParagraph"/>
+        <w:numPr>
+          <w:ilvl w:val="0"/>
+          <w:numId w:val="2"/>
+        </w:numPr>
+        <w:spacing w:after="70"/>
+      </w:pPr>
+      <w:r>
+        <w:rPr>
+          <w:rFonts w:ascii="Nirmala UI" w:cs="Nirmala UI" w:eastAsia="Nirmala UI" w:hAnsi="Nirmala UI"/>
+        </w:rPr>
+        <w:t xml:space="preserve">Accounting → Company Settings-এ গিয়ে Email ট্যাব খুলুন।</w:t>
+      </w:r>
+    </w:p>
+    <w:p>
+      <w:pPr>
+        <w:pStyle w:val="ListParagraph"/>
+        <w:numPr>
+          <w:ilvl w:val="0"/>
+          <w:numId w:val="2"/>
+        </w:numPr>
+        <w:spacing w:after="70"/>
+      </w:pPr>
+      <w:r>
+        <w:rPr>
+          <w:rFonts w:ascii="Nirmala UI" w:cs="Nirmala UI" w:eastAsia="Nirmala UI" w:hAnsi="Nirmala UI"/>
+        </w:rPr>
+        <w:t xml:space="preserve">SMTP হোস্ট, পোর্ট, ইউজারনেম ও পাসওয়ার্ড দিন।</w:t>
+      </w:r>
+    </w:p>
+    <w:p>
+      <w:pPr>
+        <w:pStyle w:val="ListParagraph"/>
+        <w:numPr>
+          <w:ilvl w:val="0"/>
+          <w:numId w:val="2"/>
+        </w:numPr>
+        <w:spacing w:after="70"/>
+      </w:pPr>
+      <w:r>
+        <w:rPr>
+          <w:rFonts w:ascii="Nirmala UI" w:cs="Nirmala UI" w:eastAsia="Nirmala UI" w:hAnsi="Nirmala UI"/>
+        </w:rPr>
+        <w:t xml:space="preserve">মেইল প্রোভাইডার প্রয়োজন করলে এনক্রিপশন পদ্ধতি নির্বাচন করুন।</w:t>
+      </w:r>
+    </w:p>
+    <w:p>
+      <w:pPr>
+        <w:pStyle w:val="ListParagraph"/>
+        <w:numPr>
+          <w:ilvl w:val="0"/>
+          <w:numId w:val="2"/>
+        </w:numPr>
+        <w:spacing w:after="70"/>
+      </w:pPr>
+      <w:r>
+        <w:rPr>
+          <w:rFonts w:ascii="Nirmala UI" w:cs="Nirmala UI" w:eastAsia="Nirmala UI" w:hAnsi="Nirmala UI"/>
+        </w:rPr>
+        <w:t xml:space="preserve">ফ্রম অ্যাড্রেস ও ফ্রম নাম দিয়ে সংরক্ষণ করুন।</w:t>
+      </w:r>
+    </w:p>
+    <w:p>
+      <w:pPr>
+        <w:pStyle w:val="ListParagraph"/>
+        <w:numPr>
+          <w:ilvl w:val="0"/>
+          <w:numId w:val="2"/>
+        </w:numPr>
+        <w:spacing w:after="70"/>
+      </w:pPr>
+      <w:r>
+        <w:rPr>
+          <w:rFonts w:ascii="Nirmala UI" w:cs="Nirmala UI" w:eastAsia="Nirmala UI" w:hAnsi="Nirmala UI"/>
+        </w:rPr>
+        <w:t xml:space="preserve">নির্ভরযোগ্যতা যাচাইয়ের জন্য "Send Test Email" ব্যবহার করুন।</w:t>
+      </w:r>
+    </w:p>
+    <w:p>
+      <w:pPr>
+        <w:pStyle w:val="Heading3"/>
+        <w:spacing w:after="100" w:before="200"/>
+      </w:pPr>
+      <w:r>
+        <w:rPr>
+          <w:rFonts w:ascii="Nirmala UI" w:cs="Nirmala UI" w:eastAsia="Nirmala UI" w:hAnsi="Nirmala UI"/>
+          <w:b/>
+          <w:bCs/>
+        </w:rPr>
         <w:t xml:space="preserve">টিপস ও সতর্কতা</w:t>
       </w:r>
     </w:p>
@@ -1805,7 +1975,1148 @@
         <w:rPr>
           <w:rFonts w:ascii="Nirmala UI" w:cs="Nirmala UI" w:eastAsia="Nirmala UI" w:hAnsi="Nirmala UI"/>
         </w:rPr>
-        <w:t xml:space="preserve">এই ফিল্ডটি খালি রাখলে কোনো লক সক্রিয় থাকবে না — অর্থাৎ যেকোনো তারিখে জার্নাল এন্ট্রি করা যাবে।</w:t>
+        <w:t xml:space="preserve">ভুল বা অসম্পূর্ণ মেইল সেটিং কোনো এরর না দেখিয়েই ব্যর্থ হতে পারে — সংরক্ষণের পর সবসময় টেস্ট ই-মেইল পাঠিয়ে যাচাই করুন।</w:t>
+      </w:r>
+    </w:p>
+    <w:p>
+      <w:pPr>
+        <w:pStyle w:val="Heading3"/>
+        <w:spacing w:after="100" w:before="200"/>
+      </w:pPr>
+      <w:r>
+        <w:rPr>
+          <w:rFonts w:ascii="Nirmala UI" w:cs="Nirmala UI" w:eastAsia="Nirmala UI" w:hAnsi="Nirmala UI"/>
+          <w:b/>
+          <w:bCs/>
+        </w:rPr>
+        <w:t xml:space="preserve">পেমেন্ট গেটওয়ে — SSLCommerz</w:t>
+      </w:r>
+    </w:p>
+    <w:p>
+      <w:pPr>
+        <w:spacing w:after="120"/>
+      </w:pPr>
+      <w:r>
+        <w:rPr>
+          <w:rFonts w:ascii="Nirmala UI" w:cs="Nirmala UI" w:eastAsia="Nirmala UI" w:hAnsi="Nirmala UI"/>
+          <w:b w:val="false"/>
+          <w:bCs w:val="false"/>
+          <w:i w:val="false"/>
+          <w:iCs w:val="false"/>
+        </w:rPr>
+        <w:t xml:space="preserve">গ্রাহকরা SSLCommerz-এর মাধ্যমে ইনভয়েস পরিশোধ করতে যে "Pay Online" লিংক ব্যবহার করেন, তা এখান থেকেই নিয়ন্ত্রিত হয়।</w:t>
+      </w:r>
+    </w:p>
+    <w:p>
+      <w:pPr>
+        <w:pStyle w:val="Heading3"/>
+        <w:spacing w:after="100" w:before="200"/>
+      </w:pPr>
+      <w:r>
+        <w:rPr>
+          <w:rFonts w:ascii="Nirmala UI" w:cs="Nirmala UI" w:eastAsia="Nirmala UI" w:hAnsi="Nirmala UI"/>
+          <w:b/>
+          <w:bCs/>
+        </w:rPr>
+        <w:t xml:space="preserve">ফর্মের ফিল্ডসমূহ</w:t>
+      </w:r>
+    </w:p>
+    <w:p>
+      <w:pPr>
+        <w:pStyle w:val="ListParagraph"/>
+        <w:numPr>
+          <w:ilvl w:val="0"/>
+          <w:numId w:val="1"/>
+        </w:numPr>
+        <w:spacing w:after="60"/>
+      </w:pPr>
+      <w:r>
+        <w:rPr>
+          <w:rFonts w:ascii="Nirmala UI" w:cs="Nirmala UI" w:eastAsia="Nirmala UI" w:hAnsi="Nirmala UI"/>
+        </w:rPr>
+        <w:t xml:space="preserve">SSLCommerz চালু করুন (চেকবক্স)</w:t>
+      </w:r>
+    </w:p>
+    <w:p>
+      <w:pPr>
+        <w:pStyle w:val="ListParagraph"/>
+        <w:numPr>
+          <w:ilvl w:val="0"/>
+          <w:numId w:val="1"/>
+        </w:numPr>
+        <w:spacing w:after="60"/>
+      </w:pPr>
+      <w:r>
+        <w:rPr>
+          <w:rFonts w:ascii="Nirmala UI" w:cs="Nirmala UI" w:eastAsia="Nirmala UI" w:hAnsi="Nirmala UI"/>
+        </w:rPr>
+        <w:t xml:space="preserve">Store ID (চালু থাকলে আবশ্যক)</w:t>
+      </w:r>
+    </w:p>
+    <w:p>
+      <w:pPr>
+        <w:pStyle w:val="ListParagraph"/>
+        <w:numPr>
+          <w:ilvl w:val="0"/>
+          <w:numId w:val="1"/>
+        </w:numPr>
+        <w:spacing w:after="60"/>
+      </w:pPr>
+      <w:r>
+        <w:rPr>
+          <w:rFonts w:ascii="Nirmala UI" w:cs="Nirmala UI" w:eastAsia="Nirmala UI" w:hAnsi="Nirmala UI"/>
+        </w:rPr>
+        <w:t xml:space="preserve">Store Password (চালু থাকলে আবশ্যক — এডিটের সময় খালি রাখলে আগেরটাই থেকে যাবে)</w:t>
+      </w:r>
+    </w:p>
+    <w:p>
+      <w:pPr>
+        <w:pStyle w:val="ListParagraph"/>
+        <w:numPr>
+          <w:ilvl w:val="0"/>
+          <w:numId w:val="1"/>
+        </w:numPr>
+        <w:spacing w:after="60"/>
+      </w:pPr>
+      <w:r>
+        <w:rPr>
+          <w:rFonts w:ascii="Nirmala UI" w:cs="Nirmala UI" w:eastAsia="Nirmala UI" w:hAnsi="Nirmala UI"/>
+        </w:rPr>
+        <w:t xml:space="preserve">Sandbox Mode (চেকবক্স — লাইভ করার আগে টেস্টের জন্য ব্যবহার করুন)</w:t>
+      </w:r>
+    </w:p>
+    <w:p>
+      <w:pPr>
+        <w:pStyle w:val="ListParagraph"/>
+        <w:numPr>
+          <w:ilvl w:val="0"/>
+          <w:numId w:val="1"/>
+        </w:numPr>
+        <w:spacing w:after="60"/>
+      </w:pPr>
+      <w:r>
+        <w:rPr>
+          <w:rFonts w:ascii="Nirmala UI" w:cs="Nirmala UI" w:eastAsia="Nirmala UI" w:hAnsi="Nirmala UI"/>
+        </w:rPr>
+        <w:t xml:space="preserve">কারেন্সি (ঐচ্ছিক)</w:t>
+      </w:r>
+    </w:p>
+    <w:p>
+      <w:pPr>
+        <w:pStyle w:val="Heading3"/>
+        <w:spacing w:after="100" w:before="200"/>
+      </w:pPr>
+      <w:r>
+        <w:rPr>
+          <w:rFonts w:ascii="Nirmala UI" w:cs="Nirmala UI" w:eastAsia="Nirmala UI" w:hAnsi="Nirmala UI"/>
+          <w:b/>
+          <w:bCs/>
+        </w:rPr>
+        <w:t xml:space="preserve">ধাপে ধাপে ব্যবহার পদ্ধতি</w:t>
+      </w:r>
+    </w:p>
+    <w:p>
+      <w:pPr>
+        <w:pStyle w:val="ListParagraph"/>
+        <w:numPr>
+          <w:ilvl w:val="0"/>
+          <w:numId w:val="2"/>
+        </w:numPr>
+        <w:spacing w:after="70"/>
+      </w:pPr>
+      <w:r>
+        <w:rPr>
+          <w:rFonts w:ascii="Nirmala UI" w:cs="Nirmala UI" w:eastAsia="Nirmala UI" w:hAnsi="Nirmala UI"/>
+        </w:rPr>
+        <w:t xml:space="preserve">Accounting → Company Settings → Payment Gateway-এ যান।</w:t>
+      </w:r>
+    </w:p>
+    <w:p>
+      <w:pPr>
+        <w:pStyle w:val="ListParagraph"/>
+        <w:numPr>
+          <w:ilvl w:val="0"/>
+          <w:numId w:val="2"/>
+        </w:numPr>
+        <w:spacing w:after="70"/>
+      </w:pPr>
+      <w:r>
+        <w:rPr>
+          <w:rFonts w:ascii="Nirmala UI" w:cs="Nirmala UI" w:eastAsia="Nirmala UI" w:hAnsi="Nirmala UI"/>
+        </w:rPr>
+        <w:t xml:space="preserve">Enable টিক দিয়ে SSLCommerz অ্যাকাউন্টের Store ID ও Store Password দিন।</w:t>
+      </w:r>
+    </w:p>
+    <w:p>
+      <w:pPr>
+        <w:pStyle w:val="ListParagraph"/>
+        <w:numPr>
+          <w:ilvl w:val="0"/>
+          <w:numId w:val="2"/>
+        </w:numPr>
+        <w:spacing w:after="70"/>
+      </w:pPr>
+      <w:r>
+        <w:rPr>
+          <w:rFonts w:ascii="Nirmala UI" w:cs="Nirmala UI" w:eastAsia="Nirmala UI" w:hAnsi="Nirmala UI"/>
+        </w:rPr>
+        <w:t xml:space="preserve">পুরোপুরি পরীক্ষা না হওয়া পর্যন্ত Sandbox Mode চালু রাখুন।</w:t>
+      </w:r>
+    </w:p>
+    <w:p>
+      <w:pPr>
+        <w:pStyle w:val="ListParagraph"/>
+        <w:numPr>
+          <w:ilvl w:val="0"/>
+          <w:numId w:val="2"/>
+        </w:numPr>
+        <w:spacing w:after="70"/>
+      </w:pPr>
+      <w:r>
+        <w:rPr>
+          <w:rFonts w:ascii="Nirmala UI" w:cs="Nirmala UI" w:eastAsia="Nirmala UI" w:hAnsi="Nirmala UI"/>
+        </w:rPr>
+        <w:t xml:space="preserve">সংরক্ষণ করে যেকোনো পোস্ট করা ইনভয়েস থেকে "Generate Payment Link" দিয়ে পরীক্ষা করুন।</w:t>
+      </w:r>
+    </w:p>
+    <w:p>
+      <w:pPr>
+        <w:pStyle w:val="Heading3"/>
+        <w:spacing w:after="100" w:before="200"/>
+      </w:pPr>
+      <w:r>
+        <w:rPr>
+          <w:rFonts w:ascii="Nirmala UI" w:cs="Nirmala UI" w:eastAsia="Nirmala UI" w:hAnsi="Nirmala UI"/>
+          <w:b/>
+          <w:bCs/>
+        </w:rPr>
+        <w:t xml:space="preserve">টিপস ও সতর্কতা</w:t>
+      </w:r>
+    </w:p>
+    <w:p>
+      <w:pPr>
+        <w:pStyle w:val="ListParagraph"/>
+        <w:numPr>
+          <w:ilvl w:val="0"/>
+          <w:numId w:val="1"/>
+        </w:numPr>
+        <w:spacing w:after="60"/>
+      </w:pPr>
+      <w:r>
+        <w:rPr>
+          <w:rFonts w:ascii="Nirmala UI" w:cs="Nirmala UI" w:eastAsia="Nirmala UI" w:hAnsi="Nirmala UI"/>
+        </w:rPr>
+        <w:t xml:space="preserve">গ্রাহককে প্রকৃত পেমেন্ট লিংক পাঠানোর আগে Sandbox Mode বন্ধ করে দিন, নাহলে লেনদেনে আসল টাকা কাটবে না।</w:t>
+      </w:r>
+    </w:p>
+    <w:p>
+      <w:pPr>
+        <w:pStyle w:val="Heading3"/>
+        <w:spacing w:after="100" w:before="200"/>
+      </w:pPr>
+      <w:r>
+        <w:rPr>
+          <w:rFonts w:ascii="Nirmala UI" w:cs="Nirmala UI" w:eastAsia="Nirmala UI" w:hAnsi="Nirmala UI"/>
+          <w:b/>
+          <w:bCs/>
+        </w:rPr>
+        <w:t xml:space="preserve">লগইন সিকিউরিটি (Login Security)</w:t>
+      </w:r>
+    </w:p>
+    <w:p>
+      <w:pPr>
+        <w:spacing w:after="120"/>
+      </w:pPr>
+      <w:r>
+        <w:rPr>
+          <w:rFonts w:ascii="Nirmala UI" w:cs="Nirmala UI" w:eastAsia="Nirmala UI" w:hAnsi="Nirmala UI"/>
+          <w:b w:val="false"/>
+          <w:bCs w:val="false"/>
+          <w:i w:val="false"/>
+          <w:iCs w:val="false"/>
+        </w:rPr>
+        <w:t xml:space="preserve">বারবার ভুল পাসওয়ার্ড দিলে ব্রুট-ফোর্স প্রতিরোধের জন্য অ্যাকাউন্ট সাময়িকভাবে লক হয়ে যায়। প্রয়োজনে প্রশাসক Security → Users থেকে সাথে সাথে আনলক করে দিতে পারেন।</w:t>
+      </w:r>
+    </w:p>
+    <w:p>
+      <w:pPr>
+        <w:pStyle w:val="Heading3"/>
+        <w:spacing w:after="100" w:before="200"/>
+      </w:pPr>
+      <w:r>
+        <w:rPr>
+          <w:rFonts w:ascii="Nirmala UI" w:cs="Nirmala UI" w:eastAsia="Nirmala UI" w:hAnsi="Nirmala UI"/>
+          <w:b/>
+          <w:bCs/>
+        </w:rPr>
+        <w:t xml:space="preserve">ফর্মের ফিল্ডসমূহ</w:t>
+      </w:r>
+    </w:p>
+    <w:p>
+      <w:pPr>
+        <w:pStyle w:val="ListParagraph"/>
+        <w:numPr>
+          <w:ilvl w:val="0"/>
+          <w:numId w:val="1"/>
+        </w:numPr>
+        <w:spacing w:after="60"/>
+      </w:pPr>
+      <w:r>
+        <w:rPr>
+          <w:rFonts w:ascii="Nirmala UI" w:cs="Nirmala UI" w:eastAsia="Nirmala UI" w:hAnsi="Nirmala UI"/>
+        </w:rPr>
+        <w:t xml:space="preserve">লক হওয়ার আগে সর্বোচ্চ ভুল চেষ্টা (৩–২০, আবশ্যক)</w:t>
+      </w:r>
+    </w:p>
+    <w:p>
+      <w:pPr>
+        <w:pStyle w:val="ListParagraph"/>
+        <w:numPr>
+          <w:ilvl w:val="0"/>
+          <w:numId w:val="1"/>
+        </w:numPr>
+        <w:spacing w:after="60"/>
+      </w:pPr>
+      <w:r>
+        <w:rPr>
+          <w:rFonts w:ascii="Nirmala UI" w:cs="Nirmala UI" w:eastAsia="Nirmala UI" w:hAnsi="Nirmala UI"/>
+        </w:rPr>
+        <w:t xml:space="preserve">লকআউটের সময়কাল, মিনিটে (১–১৪৪০, আবশ্যক)</w:t>
+      </w:r>
+    </w:p>
+    <w:p>
+      <w:pPr>
+        <w:pStyle w:val="ListParagraph"/>
+        <w:numPr>
+          <w:ilvl w:val="0"/>
+          <w:numId w:val="1"/>
+        </w:numPr>
+        <w:spacing w:after="60"/>
+      </w:pPr>
+      <w:r>
+        <w:rPr>
+          <w:rFonts w:ascii="Nirmala UI" w:cs="Nirmala UI" w:eastAsia="Nirmala UI" w:hAnsi="Nirmala UI"/>
+        </w:rPr>
+        <w:t xml:space="preserve">"লগইন ফর্মে একটি ম্যাথ সিকিউরিটি চেক দেখান" চেকবক্স (ঐচ্ছিক CAPTCHA)</w:t>
+      </w:r>
+    </w:p>
+    <w:p>
+      <w:pPr>
+        <w:pStyle w:val="Heading3"/>
+        <w:spacing w:after="100" w:before="200"/>
+      </w:pPr>
+      <w:r>
+        <w:rPr>
+          <w:rFonts w:ascii="Nirmala UI" w:cs="Nirmala UI" w:eastAsia="Nirmala UI" w:hAnsi="Nirmala UI"/>
+          <w:b/>
+          <w:bCs/>
+        </w:rPr>
+        <w:t xml:space="preserve">ধাপে ধাপে ব্যবহার পদ্ধতি</w:t>
+      </w:r>
+    </w:p>
+    <w:p>
+      <w:pPr>
+        <w:pStyle w:val="ListParagraph"/>
+        <w:numPr>
+          <w:ilvl w:val="0"/>
+          <w:numId w:val="2"/>
+        </w:numPr>
+        <w:spacing w:after="70"/>
+      </w:pPr>
+      <w:r>
+        <w:rPr>
+          <w:rFonts w:ascii="Nirmala UI" w:cs="Nirmala UI" w:eastAsia="Nirmala UI" w:hAnsi="Nirmala UI"/>
+        </w:rPr>
+        <w:t xml:space="preserve">Accounting → Company Settings → Login Security-এ যান।</w:t>
+      </w:r>
+    </w:p>
+    <w:p>
+      <w:pPr>
+        <w:pStyle w:val="ListParagraph"/>
+        <w:numPr>
+          <w:ilvl w:val="0"/>
+          <w:numId w:val="2"/>
+        </w:numPr>
+        <w:spacing w:after="70"/>
+      </w:pPr>
+      <w:r>
+        <w:rPr>
+          <w:rFonts w:ascii="Nirmala UI" w:cs="Nirmala UI" w:eastAsia="Nirmala UI" w:hAnsi="Nirmala UI"/>
+        </w:rPr>
+        <w:t xml:space="preserve">থ্রেশহোল্ড ও লকআউটের সময় নির্ধারণ করুন।</w:t>
+      </w:r>
+    </w:p>
+    <w:p>
+      <w:pPr>
+        <w:pStyle w:val="ListParagraph"/>
+        <w:numPr>
+          <w:ilvl w:val="0"/>
+          <w:numId w:val="2"/>
+        </w:numPr>
+        <w:spacing w:after="70"/>
+      </w:pPr>
+      <w:r>
+        <w:rPr>
+          <w:rFonts w:ascii="Nirmala UI" w:cs="Nirmala UI" w:eastAsia="Nirmala UI" w:hAnsi="Nirmala UI"/>
+        </w:rPr>
+        <w:t xml:space="preserve">ইচ্ছা করলে লগইন CAPTCHA চালু করুন।</w:t>
+      </w:r>
+    </w:p>
+    <w:p>
+      <w:pPr>
+        <w:pStyle w:val="ListParagraph"/>
+        <w:numPr>
+          <w:ilvl w:val="0"/>
+          <w:numId w:val="2"/>
+        </w:numPr>
+        <w:spacing w:after="70"/>
+      </w:pPr>
+      <w:r>
+        <w:rPr>
+          <w:rFonts w:ascii="Nirmala UI" w:cs="Nirmala UI" w:eastAsia="Nirmala UI" w:hAnsi="Nirmala UI"/>
+        </w:rPr>
+        <w:t xml:space="preserve">সংরক্ষণ করুন।</w:t>
+      </w:r>
+    </w:p>
+    <w:p>
+      <w:pPr>
+        <w:pStyle w:val="Heading3"/>
+        <w:spacing w:after="100" w:before="200"/>
+      </w:pPr>
+      <w:r>
+        <w:rPr>
+          <w:rFonts w:ascii="Nirmala UI" w:cs="Nirmala UI" w:eastAsia="Nirmala UI" w:hAnsi="Nirmala UI"/>
+          <w:b/>
+          <w:bCs/>
+        </w:rPr>
+        <w:t xml:space="preserve">টিপস ও সতর্কতা</w:t>
+      </w:r>
+    </w:p>
+    <w:p>
+      <w:pPr>
+        <w:pStyle w:val="ListParagraph"/>
+        <w:numPr>
+          <w:ilvl w:val="0"/>
+          <w:numId w:val="1"/>
+        </w:numPr>
+        <w:spacing w:after="60"/>
+      </w:pPr>
+      <w:r>
+        <w:rPr>
+          <w:rFonts w:ascii="Nirmala UI" w:cs="Nirmala UI" w:eastAsia="Nirmala UI" w:hAnsi="Nirmala UI"/>
+        </w:rPr>
+        <w:t xml:space="preserve">টেস্ট করার সময় নিজেই লক হয়ে গেলে, একজন প্রশাসক Security → Users থেকে আপনার অ্যাকাউন্টে "Unlock Now" ক্লিক করে দিতে পারেন (দেখুন ২.১)।</w:t>
+      </w:r>
+    </w:p>
+    <w:p>
+      <w:pPr>
+        <w:pStyle w:val="Heading3"/>
+        <w:spacing w:after="100" w:before="200"/>
+      </w:pPr>
+      <w:r>
+        <w:rPr>
+          <w:rFonts w:ascii="Nirmala UI" w:cs="Nirmala UI" w:eastAsia="Nirmala UI" w:hAnsi="Nirmala UI"/>
+          <w:b/>
+          <w:bCs/>
+        </w:rPr>
+        <w:t xml:space="preserve">আইপি হোয়াইটলিস্ট (IP Whitelist)</w:t>
+      </w:r>
+    </w:p>
+    <w:p>
+      <w:pPr>
+        <w:spacing w:after="120"/>
+      </w:pPr>
+      <w:r>
+        <w:rPr>
+          <w:rFonts w:ascii="Nirmala UI" w:cs="Nirmala UI" w:eastAsia="Nirmala UI" w:hAnsi="Nirmala UI"/>
+          <w:b w:val="false"/>
+          <w:bCs w:val="false"/>
+          <w:i w:val="false"/>
+          <w:iCs w:val="false"/>
+        </w:rPr>
+        <w:t xml:space="preserve">চালু থাকলে শুধু তালিকাভুক্ত আইপি অ্যাড্রেস থেকেই লগইন করা যাবে। তালিকা খালি থাকলে এই বিধিনিষেধ কার্যকর হয় না — তাই ভুলবশত সবাই লক হয়ে যাওয়ার সুযোগ নেই।</w:t>
+      </w:r>
+    </w:p>
+    <w:p>
+      <w:pPr>
+        <w:pStyle w:val="Heading3"/>
+        <w:spacing w:after="100" w:before="200"/>
+      </w:pPr>
+      <w:r>
+        <w:rPr>
+          <w:rFonts w:ascii="Nirmala UI" w:cs="Nirmala UI" w:eastAsia="Nirmala UI" w:hAnsi="Nirmala UI"/>
+          <w:b/>
+          <w:bCs/>
+        </w:rPr>
+        <w:t xml:space="preserve">ফর্মের ফিল্ডসমূহ</w:t>
+      </w:r>
+    </w:p>
+    <w:p>
+      <w:pPr>
+        <w:pStyle w:val="ListParagraph"/>
+        <w:numPr>
+          <w:ilvl w:val="0"/>
+          <w:numId w:val="1"/>
+        </w:numPr>
+        <w:spacing w:after="60"/>
+      </w:pPr>
+      <w:r>
+        <w:rPr>
+          <w:rFonts w:ascii="Nirmala UI" w:cs="Nirmala UI" w:eastAsia="Nirmala UI" w:hAnsi="Nirmala UI"/>
+        </w:rPr>
+        <w:t xml:space="preserve">আইপি অ্যাড্রেস বা CIDR রেঞ্জ (যেমন 203.0.113.7 বা 203.0.113.0/24)</w:t>
+      </w:r>
+    </w:p>
+    <w:p>
+      <w:pPr>
+        <w:pStyle w:val="ListParagraph"/>
+        <w:numPr>
+          <w:ilvl w:val="0"/>
+          <w:numId w:val="1"/>
+        </w:numPr>
+        <w:spacing w:after="60"/>
+      </w:pPr>
+      <w:r>
+        <w:rPr>
+          <w:rFonts w:ascii="Nirmala UI" w:cs="Nirmala UI" w:eastAsia="Nirmala UI" w:hAnsi="Nirmala UI"/>
+        </w:rPr>
+        <w:t xml:space="preserve">লেবেল (ঐচ্ছিক)</w:t>
+      </w:r>
+    </w:p>
+    <w:p>
+      <w:pPr>
+        <w:pStyle w:val="Heading3"/>
+        <w:spacing w:after="100" w:before="200"/>
+      </w:pPr>
+      <w:r>
+        <w:rPr>
+          <w:rFonts w:ascii="Nirmala UI" w:cs="Nirmala UI" w:eastAsia="Nirmala UI" w:hAnsi="Nirmala UI"/>
+          <w:b/>
+          <w:bCs/>
+        </w:rPr>
+        <w:t xml:space="preserve">ধাপে ধাপে ব্যবহার পদ্ধতি</w:t>
+      </w:r>
+    </w:p>
+    <w:p>
+      <w:pPr>
+        <w:pStyle w:val="ListParagraph"/>
+        <w:numPr>
+          <w:ilvl w:val="0"/>
+          <w:numId w:val="2"/>
+        </w:numPr>
+        <w:spacing w:after="70"/>
+      </w:pPr>
+      <w:r>
+        <w:rPr>
+          <w:rFonts w:ascii="Nirmala UI" w:cs="Nirmala UI" w:eastAsia="Nirmala UI" w:hAnsi="Nirmala UI"/>
+        </w:rPr>
+        <w:t xml:space="preserve">Accounting → Company Settings → IP Whitelist-এ যান।</w:t>
+      </w:r>
+    </w:p>
+    <w:p>
+      <w:pPr>
+        <w:pStyle w:val="ListParagraph"/>
+        <w:numPr>
+          <w:ilvl w:val="0"/>
+          <w:numId w:val="2"/>
+        </w:numPr>
+        <w:spacing w:after="70"/>
+      </w:pPr>
+      <w:r>
+        <w:rPr>
+          <w:rFonts w:ascii="Nirmala UI" w:cs="Nirmala UI" w:eastAsia="Nirmala UI" w:hAnsi="Nirmala UI"/>
+        </w:rPr>
+        <w:t xml:space="preserve">অন্তত একটি আইপি যোগ করুন — "Add My Current IP" দিয়ে নিজের আইপি সরাসরি যোগ করা যায়।</w:t>
+      </w:r>
+    </w:p>
+    <w:p>
+      <w:pPr>
+        <w:pStyle w:val="ListParagraph"/>
+        <w:numPr>
+          <w:ilvl w:val="0"/>
+          <w:numId w:val="2"/>
+        </w:numPr>
+        <w:spacing w:after="70"/>
+      </w:pPr>
+      <w:r>
+        <w:rPr>
+          <w:rFonts w:ascii="Nirmala UI" w:cs="Nirmala UI" w:eastAsia="Nirmala UI" w:hAnsi="Nirmala UI"/>
+        </w:rPr>
+        <w:t xml:space="preserve">"Restrict sign-in to whitelisted IP addresses only" টিক দিয়ে সংরক্ষণ করুন।</w:t>
+      </w:r>
+    </w:p>
+    <w:p>
+      <w:pPr>
+        <w:pStyle w:val="Heading3"/>
+        <w:spacing w:after="100" w:before="200"/>
+      </w:pPr>
+      <w:r>
+        <w:rPr>
+          <w:rFonts w:ascii="Nirmala UI" w:cs="Nirmala UI" w:eastAsia="Nirmala UI" w:hAnsi="Nirmala UI"/>
+          <w:b/>
+          <w:bCs/>
+        </w:rPr>
+        <w:t xml:space="preserve">টিপস ও সতর্কতা</w:t>
+      </w:r>
+    </w:p>
+    <w:p>
+      <w:pPr>
+        <w:pStyle w:val="ListParagraph"/>
+        <w:numPr>
+          <w:ilvl w:val="0"/>
+          <w:numId w:val="1"/>
+        </w:numPr>
+        <w:spacing w:after="60"/>
+      </w:pPr>
+      <w:r>
+        <w:rPr>
+          <w:rFonts w:ascii="Nirmala UI" w:cs="Nirmala UI" w:eastAsia="Nirmala UI" w:hAnsi="Nirmala UI"/>
+        </w:rPr>
+        <w:t xml:space="preserve">বিধিনিষেধ চালু করার আগে অবশ্যই নিজের বর্তমান আইপি যোগ করে নিন। তালিকা খালি থাকা অবস্থায় সিস্টেম এটি চালু করতে দেয় না, যাতে সবাই ভুলবশত লক হয়ে না যায়।</w:t>
+      </w:r>
+    </w:p>
+    <w:p>
+      <w:pPr>
+        <w:pStyle w:val="Heading3"/>
+        <w:spacing w:after="100" w:before="200"/>
+      </w:pPr>
+      <w:r>
+        <w:rPr>
+          <w:rFonts w:ascii="Nirmala UI" w:cs="Nirmala UI" w:eastAsia="Nirmala UI" w:hAnsi="Nirmala UI"/>
+          <w:b/>
+          <w:bCs/>
+        </w:rPr>
+        <w:t xml:space="preserve">পিরিয়ড লক (Period Lock)</w:t>
+      </w:r>
+    </w:p>
+    <w:p>
+      <w:pPr>
+        <w:spacing w:after="120"/>
+      </w:pPr>
+      <w:r>
+        <w:rPr>
+          <w:rFonts w:ascii="Nirmala UI" w:cs="Nirmala UI" w:eastAsia="Nirmala UI" w:hAnsi="Nirmala UI"/>
+          <w:b w:val="false"/>
+          <w:bCs w:val="false"/>
+          <w:i w:val="false"/>
+          <w:iCs w:val="false"/>
+        </w:rPr>
+        <w:t xml:space="preserve">পিরিয়ড লক দিয়ে একটি নির্দিষ্ট তারিখ পর্যন্ত হিসাবরক্ষণের রেকর্ড "বন্ধ" (locked) করে রাখা যায়, যাতে অতীতের হিসাব ভুলবশত পরিবর্তন না হয়। এটি সাধারণত একটি অ্যাকাউন্টিং সময়কাল (যেমন একটি মাস বা অর্থবছর) চূড়ান্তভাবে বন্ধ করার পর ব্যবহার করা হয়।</w:t>
+      </w:r>
+    </w:p>
+    <w:p>
+      <w:pPr>
+        <w:pStyle w:val="Heading3"/>
+        <w:spacing w:after="100" w:before="200"/>
+      </w:pPr>
+      <w:r>
+        <w:rPr>
+          <w:rFonts w:ascii="Nirmala UI" w:cs="Nirmala UI" w:eastAsia="Nirmala UI" w:hAnsi="Nirmala UI"/>
+          <w:b/>
+          <w:bCs/>
+        </w:rPr>
+        <w:t xml:space="preserve">ফর্মের ফিল্ডসমূহ</w:t>
+      </w:r>
+    </w:p>
+    <w:p>
+      <w:pPr>
+        <w:pStyle w:val="ListParagraph"/>
+        <w:numPr>
+          <w:ilvl w:val="0"/>
+          <w:numId w:val="1"/>
+        </w:numPr>
+        <w:spacing w:after="60"/>
+      </w:pPr>
+      <w:r>
+        <w:rPr>
+          <w:rFonts w:ascii="Nirmala UI" w:cs="Nirmala UI" w:eastAsia="Nirmala UI" w:hAnsi="Nirmala UI"/>
+        </w:rPr>
+        <w:t xml:space="preserve">লকড থ্রু তারিখ (Locked Through Date) — এই তারিখ পর্যন্ত সব লেনদেন লক থাকবে</w:t>
+      </w:r>
+    </w:p>
+    <w:p>
+      <w:pPr>
+        <w:pStyle w:val="Heading3"/>
+        <w:spacing w:after="100" w:before="200"/>
+      </w:pPr>
+      <w:r>
+        <w:rPr>
+          <w:rFonts w:ascii="Nirmala UI" w:cs="Nirmala UI" w:eastAsia="Nirmala UI" w:hAnsi="Nirmala UI"/>
+          <w:b/>
+          <w:bCs/>
+        </w:rPr>
+        <w:t xml:space="preserve">ধাপে ধাপে ব্যবহার পদ্ধতি</w:t>
+      </w:r>
+    </w:p>
+    <w:p>
+      <w:pPr>
+        <w:pStyle w:val="ListParagraph"/>
+        <w:numPr>
+          <w:ilvl w:val="0"/>
+          <w:numId w:val="2"/>
+        </w:numPr>
+        <w:spacing w:after="70"/>
+      </w:pPr>
+      <w:r>
+        <w:rPr>
+          <w:rFonts w:ascii="Nirmala UI" w:cs="Nirmala UI" w:eastAsia="Nirmala UI" w:hAnsi="Nirmala UI"/>
+        </w:rPr>
+        <w:t xml:space="preserve">Accounting → Company Settings → Period Lock-এ যান।</w:t>
+      </w:r>
+    </w:p>
+    <w:p>
+      <w:pPr>
+        <w:pStyle w:val="ListParagraph"/>
+        <w:numPr>
+          <w:ilvl w:val="0"/>
+          <w:numId w:val="2"/>
+        </w:numPr>
+        <w:spacing w:after="70"/>
+      </w:pPr>
+      <w:r>
+        <w:rPr>
+          <w:rFonts w:ascii="Nirmala UI" w:cs="Nirmala UI" w:eastAsia="Nirmala UI" w:hAnsi="Nirmala UI"/>
+        </w:rPr>
+        <w:t xml:space="preserve">যে তারিখ পর্যন্ত হিসাব লক করতে চান, সেটি নির্বাচন করে সংরক্ষণ করুন।</w:t>
+      </w:r>
+    </w:p>
+    <w:p>
+      <w:pPr>
+        <w:pStyle w:val="ListParagraph"/>
+        <w:numPr>
+          <w:ilvl w:val="0"/>
+          <w:numId w:val="2"/>
+        </w:numPr>
+        <w:spacing w:after="70"/>
+      </w:pPr>
+      <w:r>
+        <w:rPr>
+          <w:rFonts w:ascii="Nirmala UI" w:cs="Nirmala UI" w:eastAsia="Nirmala UI" w:hAnsi="Nirmala UI"/>
+        </w:rPr>
+        <w:t xml:space="preserve">লক তুলে নিতে "Remove Lock" ব্যবহার করুন (শুধু settings.manage পারমিশনধারীরা পারবেন)।</w:t>
+      </w:r>
+    </w:p>
+    <w:p>
+      <w:pPr>
+        <w:pStyle w:val="Heading3"/>
+        <w:spacing w:after="100" w:before="200"/>
+      </w:pPr>
+      <w:r>
+        <w:rPr>
+          <w:rFonts w:ascii="Nirmala UI" w:cs="Nirmala UI" w:eastAsia="Nirmala UI" w:hAnsi="Nirmala UI"/>
+          <w:b/>
+          <w:bCs/>
+        </w:rPr>
+        <w:t xml:space="preserve">টিপস ও সতর্কতা</w:t>
+      </w:r>
+    </w:p>
+    <w:p>
+      <w:pPr>
+        <w:pStyle w:val="ListParagraph"/>
+        <w:numPr>
+          <w:ilvl w:val="0"/>
+          <w:numId w:val="1"/>
+        </w:numPr>
+        <w:spacing w:after="60"/>
+      </w:pPr>
+      <w:r>
+        <w:rPr>
+          <w:rFonts w:ascii="Nirmala UI" w:cs="Nirmala UI" w:eastAsia="Nirmala UI" w:hAnsi="Nirmala UI"/>
+        </w:rPr>
+        <w:t xml:space="preserve">এই ফিল্ডটি খালি রাখলে কোনো লক সক্রিয় থাকবে না — যেকোনো তারিখে জার্নাল এন্ট্রি করা যাবে।</w:t>
+      </w:r>
+    </w:p>
+    <w:p>
+      <w:pPr>
+        <w:pStyle w:val="Heading3"/>
+        <w:spacing w:after="100" w:before="200"/>
+      </w:pPr>
+      <w:r>
+        <w:rPr>
+          <w:rFonts w:ascii="Nirmala UI" w:cs="Nirmala UI" w:eastAsia="Nirmala UI" w:hAnsi="Nirmala UI"/>
+          <w:b/>
+          <w:bCs/>
+        </w:rPr>
+        <w:t xml:space="preserve">ডকুমেন্ট নম্বরিং (Document Numbering)</w:t>
+      </w:r>
+    </w:p>
+    <w:p>
+      <w:pPr>
+        <w:spacing w:after="120"/>
+      </w:pPr>
+      <w:r>
+        <w:rPr>
+          <w:rFonts w:ascii="Nirmala UI" w:cs="Nirmala UI" w:eastAsia="Nirmala UI" w:hAnsi="Nirmala UI"/>
+          <w:b w:val="false"/>
+          <w:bCs w:val="false"/>
+          <w:i w:val="false"/>
+          <w:iCs w:val="false"/>
+        </w:rPr>
+        <w:t xml:space="preserve">প্রতিটি ডকুমেন্ট নম্বর তৈরি হয় {PREFIX}-{year}-{sequence} আকারে, যেমন INV-2026-0001। এখান থেকে প্রতিটি ডকুমেন্ট টাইপের জন্য নিজস্ব প্রিফিক্স ঠিক করা যায়, খালি রাখলে ডিফল্ট প্রিফিক্স ব্যবহৃত হবে।</w:t>
+      </w:r>
+    </w:p>
+    <w:p>
+      <w:pPr>
+        <w:pStyle w:val="Heading3"/>
+        <w:spacing w:after="100" w:before="200"/>
+      </w:pPr>
+      <w:r>
+        <w:rPr>
+          <w:rFonts w:ascii="Nirmala UI" w:cs="Nirmala UI" w:eastAsia="Nirmala UI" w:hAnsi="Nirmala UI"/>
+          <w:b/>
+          <w:bCs/>
+        </w:rPr>
+        <w:t xml:space="preserve">ফর্মের ফিল্ডসমূহ</w:t>
+      </w:r>
+    </w:p>
+    <w:p>
+      <w:pPr>
+        <w:pStyle w:val="ListParagraph"/>
+        <w:numPr>
+          <w:ilvl w:val="0"/>
+          <w:numId w:val="1"/>
+        </w:numPr>
+        <w:spacing w:after="60"/>
+      </w:pPr>
+      <w:r>
+        <w:rPr>
+          <w:rFonts w:ascii="Nirmala UI" w:cs="Nirmala UI" w:eastAsia="Nirmala UI" w:hAnsi="Nirmala UI"/>
+        </w:rPr>
+        <w:t xml:space="preserve">ডকুমেন্ট টাইপ ও তাদের ডিফল্ট প্রিফিক্স: Invoice (INV), Estimate (EST), Credit Note (CN), Customer Payment (PAY), Sales Receipt (SR), Bill (BILL), Purchase Order (PO), Vendor Credit (VC), Vendor Payment (VPAY), Expense (EXP), Bank Deposit (DEP), Transfer (TRF)।</w:t>
+      </w:r>
+    </w:p>
+    <w:p>
+      <w:pPr>
+        <w:pStyle w:val="Heading3"/>
+        <w:spacing w:after="100" w:before="200"/>
+      </w:pPr>
+      <w:r>
+        <w:rPr>
+          <w:rFonts w:ascii="Nirmala UI" w:cs="Nirmala UI" w:eastAsia="Nirmala UI" w:hAnsi="Nirmala UI"/>
+          <w:b/>
+          <w:bCs/>
+        </w:rPr>
+        <w:t xml:space="preserve">ধাপে ধাপে ব্যবহার পদ্ধতি</w:t>
+      </w:r>
+    </w:p>
+    <w:p>
+      <w:pPr>
+        <w:pStyle w:val="ListParagraph"/>
+        <w:numPr>
+          <w:ilvl w:val="0"/>
+          <w:numId w:val="2"/>
+        </w:numPr>
+        <w:spacing w:after="70"/>
+      </w:pPr>
+      <w:r>
+        <w:rPr>
+          <w:rFonts w:ascii="Nirmala UI" w:cs="Nirmala UI" w:eastAsia="Nirmala UI" w:hAnsi="Nirmala UI"/>
+        </w:rPr>
+        <w:t xml:space="preserve">Accounting → Company Settings → Document Numbering-এ যান।</w:t>
+      </w:r>
+    </w:p>
+    <w:p>
+      <w:pPr>
+        <w:pStyle w:val="ListParagraph"/>
+        <w:numPr>
+          <w:ilvl w:val="0"/>
+          <w:numId w:val="2"/>
+        </w:numPr>
+        <w:spacing w:after="70"/>
+      </w:pPr>
+      <w:r>
+        <w:rPr>
+          <w:rFonts w:ascii="Nirmala UI" w:cs="Nirmala UI" w:eastAsia="Nirmala UI" w:hAnsi="Nirmala UI"/>
+        </w:rPr>
+        <w:t xml:space="preserve">যে ডকুমেন্ট টাইপের প্রিফিক্স পরিবর্তন করতে চান তা লিখে সংরক্ষণ করুন।</w:t>
+      </w:r>
+    </w:p>
+    <w:p>
+      <w:pPr>
+        <w:pStyle w:val="Heading3"/>
+        <w:spacing w:after="100" w:before="200"/>
+      </w:pPr>
+      <w:r>
+        <w:rPr>
+          <w:rFonts w:ascii="Nirmala UI" w:cs="Nirmala UI" w:eastAsia="Nirmala UI" w:hAnsi="Nirmala UI"/>
+          <w:b/>
+          <w:bCs/>
+        </w:rPr>
+        <w:t xml:space="preserve">টিপস ও সতর্কতা</w:t>
+      </w:r>
+    </w:p>
+    <w:p>
+      <w:pPr>
+        <w:pStyle w:val="ListParagraph"/>
+        <w:numPr>
+          <w:ilvl w:val="0"/>
+          <w:numId w:val="1"/>
+        </w:numPr>
+        <w:spacing w:after="60"/>
+      </w:pPr>
+      <w:r>
+        <w:rPr>
+          <w:rFonts w:ascii="Nirmala UI" w:cs="Nirmala UI" w:eastAsia="Nirmala UI" w:hAnsi="Nirmala UI"/>
+        </w:rPr>
+        <w:t xml:space="preserve">প্রিফিক্স পরিবর্তন করলে শুধু পরিবর্তনের পরে তৈরি হওয়া ডকুমেন্টেই প্রভাব পড়বে — আগের ডকুমেন্ট নম্বর পরিবর্তন হয় না।</w:t>
+      </w:r>
+    </w:p>
+    <w:p>
+      <w:pPr>
+        <w:pStyle w:val="Heading2"/>
+        <w:spacing w:after="160" w:before="300"/>
+      </w:pPr>
+      <w:r>
+        <w:rPr>
+          <w:rFonts w:ascii="Nirmala UI" w:cs="Nirmala UI" w:eastAsia="Nirmala UI" w:hAnsi="Nirmala UI"/>
+          <w:b/>
+          <w:bCs/>
+          <w:color w:val="1F4E79"/>
+        </w:rPr>
+        <w:t xml:space="preserve">২.৪ </w:t>
+      </w:r>
+      <w:r>
+        <w:rPr>
+          <w:rFonts w:ascii="Nirmala UI" w:cs="Nirmala UI" w:eastAsia="Nirmala UI" w:hAnsi="Nirmala UI"/>
+          <w:b/>
+          <w:bCs/>
+          <w:color w:val="1F4E79"/>
+        </w:rPr>
+        <w:t xml:space="preserve">লগইন হিস্টোরি (Login History)</w:t>
+      </w:r>
+    </w:p>
+    <w:p>
+      <w:pPr>
+        <w:spacing w:after="60"/>
+      </w:pPr>
+      <w:r>
+        <w:rPr>
+          <w:rFonts w:ascii="Nirmala UI" w:cs="Nirmala UI" w:eastAsia="Nirmala UI" w:hAnsi="Nirmala UI"/>
+          <w:b/>
+          <w:bCs/>
+          <w:color w:val="555555"/>
+        </w:rPr>
+        <w:t xml:space="preserve">মেনু পথ: </w:t>
+      </w:r>
+      <w:r>
+        <w:rPr>
+          <w:rFonts w:ascii="Nirmala UI" w:cs="Nirmala UI" w:eastAsia="Nirmala UI" w:hAnsi="Nirmala UI"/>
+          <w:color w:val="555555"/>
+        </w:rPr>
+        <w:t xml:space="preserve">Security → Login History</w:t>
+      </w:r>
+    </w:p>
+    <w:p>
+      <w:pPr>
+        <w:spacing w:after="60"/>
+      </w:pPr>
+      <w:r>
+        <w:rPr>
+          <w:rFonts w:ascii="Nirmala UI" w:cs="Nirmala UI" w:eastAsia="Nirmala UI" w:hAnsi="Nirmala UI"/>
+          <w:b/>
+          <w:bCs/>
+          <w:color w:val="555555"/>
+        </w:rPr>
+        <w:t xml:space="preserve">প্রয়োজনীয় পারমিশন: </w:t>
+      </w:r>
+      <w:r>
+        <w:rPr>
+          <w:rFonts w:ascii="Nirmala UI" w:cs="Nirmala UI" w:eastAsia="Nirmala UI" w:hAnsi="Nirmala UI"/>
+          <w:color w:val="555555"/>
+        </w:rPr>
+        <w:t xml:space="preserve">audit.view</w:t>
+      </w:r>
+    </w:p>
+    <w:p>
+      <w:pPr>
+        <w:spacing w:after="60"/>
+      </w:pPr>
+      <w:r>
+        <w:rPr>
+          <w:rFonts w:ascii="Nirmala UI" w:cs="Nirmala UI" w:eastAsia="Nirmala UI" w:hAnsi="Nirmala UI"/>
+          <w:b/>
+          <w:bCs/>
+          <w:color w:val="555555"/>
+        </w:rPr>
+        <w:t xml:space="preserve">নির্ভরতা (আগে যা থাকা দরকার): </w:t>
+      </w:r>
+      <w:r>
+        <w:rPr>
+          <w:rFonts w:ascii="Nirmala UI" w:cs="Nirmala UI" w:eastAsia="Nirmala UI" w:hAnsi="Nirmala UI"/>
+          <w:color w:val="555555"/>
+        </w:rPr>
+        <w:t xml:space="preserve">কিছু লগইন কার্যকলাপ (সাইন-ইন, সাইন-আউট, ব্যর্থ বা ব্লকড চেষ্টা) আগে থেকে থাকতে হবে।</w:t>
+      </w:r>
+    </w:p>
+    <w:p>
+      <w:pPr>
+        <w:spacing w:after="120"/>
+      </w:pPr>
+      <w:r>
+        <w:rPr>
+          <w:rFonts w:ascii="Nirmala UI" w:cs="Nirmala UI" w:eastAsia="Nirmala UI" w:hAnsi="Nirmala UI"/>
+          <w:b w:val="false"/>
+          <w:bCs w:val="false"/>
+          <w:i w:val="false"/>
+          <w:iCs w:val="false"/>
+        </w:rPr>
+        <w:t xml:space="preserve">প্রতিটি সাইন-ইন, সাইন-আউট এবং ব্যর্থ বা ব্লকড লগইন চেষ্টা এখানে স্বয়ংক্রিয়ভাবে লগ হয়, সাথে অনুরোধকারী আইপি অ্যাড্রেস ও ডিভাইসও দেখা যায় — অপরিচিত জায়গা থেকে বারবার ব্যর্থ লগইন চেষ্টার মতো সন্দেহজনক কার্যকলাপ ধরতে এটি কাজে লাগে।</w:t>
+      </w:r>
+    </w:p>
+    <w:p>
+      <w:pPr>
+        <w:pStyle w:val="Heading3"/>
+        <w:spacing w:after="100" w:before="200"/>
+      </w:pPr>
+      <w:r>
+        <w:rPr>
+          <w:rFonts w:ascii="Nirmala UI" w:cs="Nirmala UI" w:eastAsia="Nirmala UI" w:hAnsi="Nirmala UI"/>
+          <w:b/>
+          <w:bCs/>
+        </w:rPr>
+        <w:t xml:space="preserve">ফর্মের ফিল্ডসমূহ</w:t>
+      </w:r>
+    </w:p>
+    <w:p>
+      <w:pPr>
+        <w:pStyle w:val="ListParagraph"/>
+        <w:numPr>
+          <w:ilvl w:val="0"/>
+          <w:numId w:val="1"/>
+        </w:numPr>
+        <w:spacing w:after="60"/>
+      </w:pPr>
+      <w:r>
+        <w:rPr>
+          <w:rFonts w:ascii="Nirmala UI" w:cs="Nirmala UI" w:eastAsia="Nirmala UI" w:hAnsi="Nirmala UI"/>
+        </w:rPr>
+        <w:t xml:space="preserve">সময় (Timestamp)</w:t>
+      </w:r>
+    </w:p>
+    <w:p>
+      <w:pPr>
+        <w:pStyle w:val="ListParagraph"/>
+        <w:numPr>
+          <w:ilvl w:val="0"/>
+          <w:numId w:val="1"/>
+        </w:numPr>
+        <w:spacing w:after="60"/>
+      </w:pPr>
+      <w:r>
+        <w:rPr>
+          <w:rFonts w:ascii="Nirmala UI" w:cs="Nirmala UI" w:eastAsia="Nirmala UI" w:hAnsi="Nirmala UI"/>
+        </w:rPr>
+        <w:t xml:space="preserve">ঘটনা (Login / Logout / Failed attempt / Blocked ইত্যাদি)</w:t>
+      </w:r>
+    </w:p>
+    <w:p>
+      <w:pPr>
+        <w:pStyle w:val="ListParagraph"/>
+        <w:numPr>
+          <w:ilvl w:val="0"/>
+          <w:numId w:val="1"/>
+        </w:numPr>
+        <w:spacing w:after="60"/>
+      </w:pPr>
+      <w:r>
+        <w:rPr>
+          <w:rFonts w:ascii="Nirmala UI" w:cs="Nirmala UI" w:eastAsia="Nirmala UI" w:hAnsi="Nirmala UI"/>
+        </w:rPr>
+        <w:t xml:space="preserve">ব্যবহারকারী</w:t>
+      </w:r>
+    </w:p>
+    <w:p>
+      <w:pPr>
+        <w:pStyle w:val="ListParagraph"/>
+        <w:numPr>
+          <w:ilvl w:val="0"/>
+          <w:numId w:val="1"/>
+        </w:numPr>
+        <w:spacing w:after="60"/>
+      </w:pPr>
+      <w:r>
+        <w:rPr>
+          <w:rFonts w:ascii="Nirmala UI" w:cs="Nirmala UI" w:eastAsia="Nirmala UI" w:hAnsi="Nirmala UI"/>
+        </w:rPr>
+        <w:t xml:space="preserve">আইপি অ্যাড্রেস</w:t>
+      </w:r>
+    </w:p>
+    <w:p>
+      <w:pPr>
+        <w:pStyle w:val="ListParagraph"/>
+        <w:numPr>
+          <w:ilvl w:val="0"/>
+          <w:numId w:val="1"/>
+        </w:numPr>
+        <w:spacing w:after="60"/>
+      </w:pPr>
+      <w:r>
+        <w:rPr>
+          <w:rFonts w:ascii="Nirmala UI" w:cs="Nirmala UI" w:eastAsia="Nirmala UI" w:hAnsi="Nirmala UI"/>
+        </w:rPr>
+        <w:t xml:space="preserve">ডিভাইস</w:t>
+      </w:r>
+    </w:p>
+    <w:p>
+      <w:pPr>
+        <w:pStyle w:val="Heading3"/>
+        <w:spacing w:after="100" w:before="200"/>
+      </w:pPr>
+      <w:r>
+        <w:rPr>
+          <w:rFonts w:ascii="Nirmala UI" w:cs="Nirmala UI" w:eastAsia="Nirmala UI" w:hAnsi="Nirmala UI"/>
+          <w:b/>
+          <w:bCs/>
+        </w:rPr>
+        <w:t xml:space="preserve">ধাপে ধাপে ব্যবহার পদ্ধতি</w:t>
+      </w:r>
+    </w:p>
+    <w:p>
+      <w:pPr>
+        <w:pStyle w:val="ListParagraph"/>
+        <w:numPr>
+          <w:ilvl w:val="0"/>
+          <w:numId w:val="2"/>
+        </w:numPr>
+        <w:spacing w:after="70"/>
+      </w:pPr>
+      <w:r>
+        <w:rPr>
+          <w:rFonts w:ascii="Nirmala UI" w:cs="Nirmala UI" w:eastAsia="Nirmala UI" w:hAnsi="Nirmala UI"/>
+        </w:rPr>
+        <w:t xml:space="preserve">Security → Login History-তে যান।</w:t>
+      </w:r>
+    </w:p>
+    <w:p>
+      <w:pPr>
+        <w:pStyle w:val="ListParagraph"/>
+        <w:numPr>
+          <w:ilvl w:val="0"/>
+          <w:numId w:val="2"/>
+        </w:numPr>
+        <w:spacing w:after="70"/>
+      </w:pPr>
+      <w:r>
+        <w:rPr>
+          <w:rFonts w:ascii="Nirmala UI" w:cs="Nirmala UI" w:eastAsia="Nirmala UI" w:hAnsi="Nirmala UI"/>
+        </w:rPr>
+        <w:t xml:space="preserve">সাম্প্রতিক এন্ট্রি (নতুন থেকে পুরনো) পর্যালোচনা করুন।</w:t>
+      </w:r>
+    </w:p>
+    <w:p>
+      <w:pPr>
+        <w:pStyle w:val="ListParagraph"/>
+        <w:numPr>
+          <w:ilvl w:val="0"/>
+          <w:numId w:val="2"/>
+        </w:numPr>
+        <w:spacing w:after="70"/>
+      </w:pPr>
+      <w:r>
+        <w:rPr>
+          <w:rFonts w:ascii="Nirmala UI" w:cs="Nirmala UI" w:eastAsia="Nirmala UI" w:hAnsi="Nirmala UI"/>
+        </w:rPr>
+        <w:t xml:space="preserve">অপরিচিত আইপি থেকে বারবার "Failed attempt" দেখলে Login Security ও IP Whitelist সেটিং (২.৩ দেখুন) ব্যবহার করে ব্যবস্থা নিন।</w:t>
       </w:r>
     </w:p>
     <w:p>
@@ -6866,6 +8177,342 @@
           <w:rFonts w:ascii="Nirmala UI" w:cs="Nirmala UI" w:eastAsia="Nirmala UI" w:hAnsi="Nirmala UI"/>
         </w:rPr>
         <w:t xml:space="preserve">যদি ইনভয়েসের কোনো লাইনে "Deferred Revenue" চালু করা থাকে, তাহলে সংশ্লিষ্ট আয় সাথে সাথে না দেখিয়ে নির্ধারিত মাসের ভিত্তিতে ধীরে ধীরে স্বীকৃত (recognize) হয় — এই প্রক্রিয়াটি Sales → Deferred Revenue থেকে পর্যবেক্ষণ করা যায়।</w:t>
+      </w:r>
+    </w:p>
+    <w:p>
+      <w:pPr>
+        <w:pStyle w:val="Heading2"/>
+        <w:spacing w:after="160" w:before="300"/>
+      </w:pPr>
+      <w:r>
+        <w:rPr>
+          <w:rFonts w:ascii="Nirmala UI" w:cs="Nirmala UI" w:eastAsia="Nirmala UI" w:hAnsi="Nirmala UI"/>
+          <w:b/>
+          <w:bCs/>
+          <w:color w:val="1F4E79"/>
+        </w:rPr>
+        <w:t xml:space="preserve">৬.৬ </w:t>
+      </w:r>
+      <w:r>
+        <w:rPr>
+          <w:rFonts w:ascii="Nirmala UI" w:cs="Nirmala UI" w:eastAsia="Nirmala UI" w:hAnsi="Nirmala UI"/>
+          <w:b/>
+          <w:bCs/>
+          <w:color w:val="1F4E79"/>
+        </w:rPr>
+        <w:t xml:space="preserve">সেলস রিসিট (Sales Receipts)</w:t>
+      </w:r>
+    </w:p>
+    <w:p>
+      <w:pPr>
+        <w:spacing w:after="60"/>
+      </w:pPr>
+      <w:r>
+        <w:rPr>
+          <w:rFonts w:ascii="Nirmala UI" w:cs="Nirmala UI" w:eastAsia="Nirmala UI" w:hAnsi="Nirmala UI"/>
+          <w:b/>
+          <w:bCs/>
+          <w:color w:val="555555"/>
+        </w:rPr>
+        <w:t xml:space="preserve">মেনু পথ: </w:t>
+      </w:r>
+      <w:r>
+        <w:rPr>
+          <w:rFonts w:ascii="Nirmala UI" w:cs="Nirmala UI" w:eastAsia="Nirmala UI" w:hAnsi="Nirmala UI"/>
+          <w:color w:val="555555"/>
+        </w:rPr>
+        <w:t xml:space="preserve">Sales → Sales Receipts</w:t>
+      </w:r>
+    </w:p>
+    <w:p>
+      <w:pPr>
+        <w:spacing w:after="60"/>
+      </w:pPr>
+      <w:r>
+        <w:rPr>
+          <w:rFonts w:ascii="Nirmala UI" w:cs="Nirmala UI" w:eastAsia="Nirmala UI" w:hAnsi="Nirmala UI"/>
+          <w:b/>
+          <w:bCs/>
+          <w:color w:val="555555"/>
+        </w:rPr>
+        <w:t xml:space="preserve">প্রয়োজনীয় পারমিশন: </w:t>
+      </w:r>
+      <w:r>
+        <w:rPr>
+          <w:rFonts w:ascii="Nirmala UI" w:cs="Nirmala UI" w:eastAsia="Nirmala UI" w:hAnsi="Nirmala UI"/>
+          <w:color w:val="555555"/>
+        </w:rPr>
+        <w:t xml:space="preserve">invoices.view (দেখা), invoices.manage (তৈরি)</w:t>
+      </w:r>
+    </w:p>
+    <w:p>
+      <w:pPr>
+        <w:spacing w:after="60"/>
+      </w:pPr>
+      <w:r>
+        <w:rPr>
+          <w:rFonts w:ascii="Nirmala UI" w:cs="Nirmala UI" w:eastAsia="Nirmala UI" w:hAnsi="Nirmala UI"/>
+          <w:b/>
+          <w:bCs/>
+          <w:color w:val="555555"/>
+        </w:rPr>
+        <w:t xml:space="preserve">নির্ভরতা (আগে যা থাকা দরকার): </w:t>
+      </w:r>
+      <w:r>
+        <w:rPr>
+          <w:rFonts w:ascii="Nirmala UI" w:cs="Nirmala UI" w:eastAsia="Nirmala UI" w:hAnsi="Nirmala UI"/>
+          <w:color w:val="555555"/>
+        </w:rPr>
+        <w:t xml:space="preserve">গ্রাহক, চার্ট অব অ্যাকাউন্টস (একটি ব্যাংক/ক্যাশ "Deposit To" অ্যাকাউন্ট ও একটি আয়ের অ্যাকাউন্ট), ঐচ্ছিকভাবে পণ্য ও ট্যাক্স রেট।</w:t>
+      </w:r>
+    </w:p>
+    <w:p>
+      <w:pPr>
+        <w:spacing w:after="120"/>
+      </w:pPr>
+      <w:r>
+        <w:rPr>
+          <w:rFonts w:ascii="Nirmala UI" w:cs="Nirmala UI" w:eastAsia="Nirmala UI" w:hAnsi="Nirmala UI"/>
+          <w:b w:val="false"/>
+          <w:bCs w:val="false"/>
+          <w:i w:val="false"/>
+          <w:iCs w:val="false"/>
+        </w:rPr>
+        <w:t xml:space="preserve">সেলস রিসিট এমন একটি তাৎক্ষণিক নগদ বিক্রয় রেকর্ড করে, যেখানে বিক্রয় ও টাকা পাওয়া একই মুহূর্তে ঘটে — যেমন কাউন্টারে সরাসরি পেমেন্ট। ইনভয়েসের মতো এটি কখনো বকেয়া (Accounts Receivable) হিসেবে থাকে না — এখানে কোনো ড্রাফট অবস্থা, ডিউ ডেট বা আলাদা পেমেন্ট ধাপ নেই। সংরক্ষণ করার সাথে সাথেই এর হিসাবরক্ষণ এন্ট্রি পোস্ট হয়ে যায় (Deposit অ্যাকাউন্ট ডেবিট, আয়ের অ্যাকাউন্ট ক্রেডিট), এবং পরে এটি এডিট বা ডিলিট করা যায় না — পরবর্তীতে সংশোধন প্রয়োজন হলে ক্রেডিট নোট বা ম্যানুয়াল জার্নাল এন্ট্রি ব্যবহার করুন।</w:t>
+      </w:r>
+    </w:p>
+    <w:p>
+      <w:pPr>
+        <w:pStyle w:val="Heading3"/>
+        <w:spacing w:after="100" w:before="200"/>
+      </w:pPr>
+      <w:r>
+        <w:rPr>
+          <w:rFonts w:ascii="Nirmala UI" w:cs="Nirmala UI" w:eastAsia="Nirmala UI" w:hAnsi="Nirmala UI"/>
+          <w:b/>
+          <w:bCs/>
+        </w:rPr>
+        <w:t xml:space="preserve">ফর্মের ফিল্ডসমূহ</w:t>
+      </w:r>
+    </w:p>
+    <w:p>
+      <w:pPr>
+        <w:pStyle w:val="ListParagraph"/>
+        <w:numPr>
+          <w:ilvl w:val="0"/>
+          <w:numId w:val="1"/>
+        </w:numPr>
+        <w:spacing w:after="60"/>
+      </w:pPr>
+      <w:r>
+        <w:rPr>
+          <w:rFonts w:ascii="Nirmala UI" w:cs="Nirmala UI" w:eastAsia="Nirmala UI" w:hAnsi="Nirmala UI"/>
+        </w:rPr>
+        <w:t xml:space="preserve">গ্রাহক (আবশ্যক)</w:t>
+      </w:r>
+    </w:p>
+    <w:p>
+      <w:pPr>
+        <w:pStyle w:val="ListParagraph"/>
+        <w:numPr>
+          <w:ilvl w:val="0"/>
+          <w:numId w:val="1"/>
+        </w:numPr>
+        <w:spacing w:after="60"/>
+      </w:pPr>
+      <w:r>
+        <w:rPr>
+          <w:rFonts w:ascii="Nirmala UI" w:cs="Nirmala UI" w:eastAsia="Nirmala UI" w:hAnsi="Nirmala UI"/>
+        </w:rPr>
+        <w:t xml:space="preserve">ডিপোজিট টু — যে ব্যাংক/ক্যাশ অ্যাকাউন্টে টাকা জমা হবে (আবশ্যক)</w:t>
+      </w:r>
+    </w:p>
+    <w:p>
+      <w:pPr>
+        <w:pStyle w:val="ListParagraph"/>
+        <w:numPr>
+          <w:ilvl w:val="0"/>
+          <w:numId w:val="1"/>
+        </w:numPr>
+        <w:spacing w:after="60"/>
+      </w:pPr>
+      <w:r>
+        <w:rPr>
+          <w:rFonts w:ascii="Nirmala UI" w:cs="Nirmala UI" w:eastAsia="Nirmala UI" w:hAnsi="Nirmala UI"/>
+        </w:rPr>
+        <w:t xml:space="preserve">রিসিট তারিখ (আবশ্যক)</w:t>
+      </w:r>
+    </w:p>
+    <w:p>
+      <w:pPr>
+        <w:pStyle w:val="ListParagraph"/>
+        <w:numPr>
+          <w:ilvl w:val="0"/>
+          <w:numId w:val="1"/>
+        </w:numPr>
+        <w:spacing w:after="60"/>
+      </w:pPr>
+      <w:r>
+        <w:rPr>
+          <w:rFonts w:ascii="Nirmala UI" w:cs="Nirmala UI" w:eastAsia="Nirmala UI" w:hAnsi="Nirmala UI"/>
+        </w:rPr>
+        <w:t xml:space="preserve">"দাম-এ ট্যাক্স অন্তর্ভুক্ত" চেকবক্স (ঐচ্ছিক)</w:t>
+      </w:r>
+    </w:p>
+    <w:p>
+      <w:pPr>
+        <w:pStyle w:val="ListParagraph"/>
+        <w:numPr>
+          <w:ilvl w:val="0"/>
+          <w:numId w:val="1"/>
+        </w:numPr>
+        <w:spacing w:after="60"/>
+      </w:pPr>
+      <w:r>
+        <w:rPr>
+          <w:rFonts w:ascii="Nirmala UI" w:cs="Nirmala UI" w:eastAsia="Nirmala UI" w:hAnsi="Nirmala UI"/>
+        </w:rPr>
+        <w:t xml:space="preserve">লাইন-আইটেম টেবিল: পণ্য (ঐচ্ছিক), আয়ের অ্যাকাউন্ট, বিবরণ, পরিমাণ, একক মূল্য, ছাড়, ট্যাক্স/ট্যাক্স ২</w:t>
+      </w:r>
+    </w:p>
+    <w:p>
+      <w:pPr>
+        <w:pStyle w:val="ListParagraph"/>
+        <w:numPr>
+          <w:ilvl w:val="0"/>
+          <w:numId w:val="1"/>
+        </w:numPr>
+        <w:spacing w:after="60"/>
+      </w:pPr>
+      <w:r>
+        <w:rPr>
+          <w:rFonts w:ascii="Nirmala UI" w:cs="Nirmala UI" w:eastAsia="Nirmala UI" w:hAnsi="Nirmala UI"/>
+        </w:rPr>
+        <w:t xml:space="preserve">নোট (ঐচ্ছিক)</w:t>
+      </w:r>
+    </w:p>
+    <w:p>
+      <w:pPr>
+        <w:pStyle w:val="Heading3"/>
+        <w:spacing w:after="100" w:before="200"/>
+      </w:pPr>
+      <w:r>
+        <w:rPr>
+          <w:rFonts w:ascii="Nirmala UI" w:cs="Nirmala UI" w:eastAsia="Nirmala UI" w:hAnsi="Nirmala UI"/>
+          <w:b/>
+          <w:bCs/>
+        </w:rPr>
+        <w:t xml:space="preserve">ধাপে ধাপে ব্যবহার পদ্ধতি</w:t>
+      </w:r>
+    </w:p>
+    <w:p>
+      <w:pPr>
+        <w:pStyle w:val="ListParagraph"/>
+        <w:numPr>
+          <w:ilvl w:val="0"/>
+          <w:numId w:val="2"/>
+        </w:numPr>
+        <w:spacing w:after="70"/>
+      </w:pPr>
+      <w:r>
+        <w:rPr>
+          <w:rFonts w:ascii="Nirmala UI" w:cs="Nirmala UI" w:eastAsia="Nirmala UI" w:hAnsi="Nirmala UI"/>
+        </w:rPr>
+        <w:t xml:space="preserve">Sales → Sales Receipts-এ গিয়ে "Add" ক্লিক করুন।</w:t>
+      </w:r>
+    </w:p>
+    <w:p>
+      <w:pPr>
+        <w:pStyle w:val="ListParagraph"/>
+        <w:numPr>
+          <w:ilvl w:val="0"/>
+          <w:numId w:val="2"/>
+        </w:numPr>
+        <w:spacing w:after="70"/>
+      </w:pPr>
+      <w:r>
+        <w:rPr>
+          <w:rFonts w:ascii="Nirmala UI" w:cs="Nirmala UI" w:eastAsia="Nirmala UI" w:hAnsi="Nirmala UI"/>
+        </w:rPr>
+        <w:t xml:space="preserve">গ্রাহক ও Deposit To অ্যাকাউন্ট নির্বাচন করুন।</w:t>
+      </w:r>
+    </w:p>
+    <w:p>
+      <w:pPr>
+        <w:pStyle w:val="ListParagraph"/>
+        <w:numPr>
+          <w:ilvl w:val="0"/>
+          <w:numId w:val="2"/>
+        </w:numPr>
+        <w:spacing w:after="70"/>
+      </w:pPr>
+      <w:r>
+        <w:rPr>
+          <w:rFonts w:ascii="Nirmala UI" w:cs="Nirmala UI" w:eastAsia="Nirmala UI" w:hAnsi="Nirmala UI"/>
+        </w:rPr>
+        <w:t xml:space="preserve">লাইন-আইটেমে পণ্য/সেবা যোগ করুন — প্রয়োজনে পরিমাণ, দাম, ছাড় ও ট্যাক্স সমন্বয় করুন।</w:t>
+      </w:r>
+    </w:p>
+    <w:p>
+      <w:pPr>
+        <w:pStyle w:val="ListParagraph"/>
+        <w:numPr>
+          <w:ilvl w:val="0"/>
+          <w:numId w:val="2"/>
+        </w:numPr>
+        <w:spacing w:after="70"/>
+      </w:pPr>
+      <w:r>
+        <w:rPr>
+          <w:rFonts w:ascii="Nirmala UI" w:cs="Nirmala UI" w:eastAsia="Nirmala UI" w:hAnsi="Nirmala UI"/>
+        </w:rPr>
+        <w:t xml:space="preserve">সংরক্ষণ করুন — রিসিটটি সাথে সাথে রেকর্ড ও পোস্ট হয়ে যাবে; এর ডিটেইল পেজ থেকে পিডিএফ ডাউনলোড করা যায়।</w:t>
+      </w:r>
+    </w:p>
+    <w:p>
+      <w:pPr>
+        <w:pStyle w:val="Heading3"/>
+        <w:spacing w:after="100" w:before="200"/>
+      </w:pPr>
+      <w:r>
+        <w:rPr>
+          <w:rFonts w:ascii="Nirmala UI" w:cs="Nirmala UI" w:eastAsia="Nirmala UI" w:hAnsi="Nirmala UI"/>
+          <w:b/>
+          <w:bCs/>
+        </w:rPr>
+        <w:t xml:space="preserve">টিপস ও সতর্কতা</w:t>
+      </w:r>
+    </w:p>
+    <w:p>
+      <w:pPr>
+        <w:pStyle w:val="ListParagraph"/>
+        <w:numPr>
+          <w:ilvl w:val="0"/>
+          <w:numId w:val="1"/>
+        </w:numPr>
+        <w:spacing w:after="60"/>
+      </w:pPr>
+      <w:r>
+        <w:rPr>
+          <w:rFonts w:ascii="Nirmala UI" w:cs="Nirmala UI" w:eastAsia="Nirmala UI" w:hAnsi="Nirmala UI"/>
+        </w:rPr>
+        <w:t xml:space="preserve">তাৎক্ষণিক পেমেন্টের নগদ বিক্রয়ের জন্য সেলস রিসিট ব্যবহার করুন; গ্রাহক পরে পরিশোধ করলে ইনভয়েস ও তারপর Receive Payment ব্যবহার করুন।</w:t>
+      </w:r>
+    </w:p>
+    <w:p>
+      <w:pPr>
+        <w:pStyle w:val="ListParagraph"/>
+        <w:numPr>
+          <w:ilvl w:val="0"/>
+          <w:numId w:val="1"/>
+        </w:numPr>
+        <w:spacing w:after="60"/>
+      </w:pPr>
+      <w:r>
+        <w:rPr>
+          <w:rFonts w:ascii="Nirmala UI" w:cs="Nirmala UI" w:eastAsia="Nirmala UI" w:hAnsi="Nirmala UI"/>
+        </w:rPr>
+        <w:t xml:space="preserve">এখানে কোনো ড্রাফট বা এডিট ধাপ নেই বলে সংরক্ষণের আগে লাইন-আইটেম ভালোভাবে যাচাই করে নিন।</w:t>
       </w:r>
     </w:p>
     <w:p>
@@ -13270,6 +14917,42 @@
           </w:p>
         </w:tc>
       </w:tr>
+      <w:tr>
+        <w:tc>
+          <w:tcPr>
+            <w:tcW w:type="dxa" w:w="2800"/>
+            <w:shd w:fill="F4F7FB" w:val="clear"/>
+          </w:tcPr>
+          <w:p>
+            <w:r>
+              <w:rPr>
+                <w:rFonts w:ascii="Nirmala UI" w:cs="Nirmala UI" w:eastAsia="Nirmala UI" w:hAnsi="Nirmala UI"/>
+                <w:b/>
+                <w:bCs/>
+                <w:sz w:val="20"/>
+                <w:szCs w:val="20"/>
+              </w:rPr>
+              <w:t xml:space="preserve">সেলস রিসিট (Sales Receipt)</w:t>
+            </w:r>
+          </w:p>
+        </w:tc>
+        <w:tc>
+          <w:tcPr>
+            <w:tcW w:type="dxa" w:w="6700"/>
+            <w:shd w:fill="F4F7FB" w:val="clear"/>
+          </w:tcPr>
+          <w:p>
+            <w:r>
+              <w:rPr>
+                <w:rFonts w:ascii="Nirmala UI" w:cs="Nirmala UI" w:eastAsia="Nirmala UI" w:hAnsi="Nirmala UI"/>
+                <w:sz w:val="20"/>
+                <w:szCs w:val="20"/>
+              </w:rPr>
+              <w:t xml:space="preserve">তাৎক্ষণিক নগদ বিক্রয় যা সাথে সাথে পোস্ট হয়ে যায় এবং ইনভয়েসের মতো কোনো বকেয়া (Accounts Receivable) তৈরি করে না।</w:t>
+            </w:r>
+          </w:p>
+        </w:tc>
+      </w:tr>
     </w:tbl>
     <w:p>
       <w:pPr>
@@ -13684,6 +15367,114 @@
           </w:p>
         </w:tc>
       </w:tr>
+      <w:tr>
+        <w:tc>
+          <w:tcPr>
+            <w:tcW w:type="dxa" w:w="3800"/>
+            <w:shd w:fill="FFFFFF" w:val="clear"/>
+          </w:tcPr>
+          <w:p>
+            <w:r>
+              <w:rPr>
+                <w:rFonts w:ascii="Nirmala UI" w:cs="Nirmala UI" w:eastAsia="Nirmala UI" w:hAnsi="Nirmala UI"/>
+                <w:b/>
+                <w:bCs/>
+                <w:sz w:val="20"/>
+                <w:szCs w:val="20"/>
+              </w:rPr>
+              <w:t xml:space="preserve">লগইন করতে গেলে বলছে আমার অ্যাকাউন্ট লক হয়ে গেছে।</w:t>
+            </w:r>
+          </w:p>
+        </w:tc>
+        <w:tc>
+          <w:tcPr>
+            <w:tcW w:type="dxa" w:w="5700"/>
+            <w:shd w:fill="FFFFFF" w:val="clear"/>
+          </w:tcPr>
+          <w:p>
+            <w:r>
+              <w:rPr>
+                <w:rFonts w:ascii="Nirmala UI" w:cs="Nirmala UI" w:eastAsia="Nirmala UI" w:hAnsi="Nirmala UI"/>
+                <w:sz w:val="20"/>
+                <w:szCs w:val="20"/>
+              </w:rPr>
+              <w:t xml:space="preserve">বারবার ভুল পাসওয়ার্ড দিলে সাময়িক লকআউট চালু হয় (থ্রেশহোল্ড ও সময়কাল Accounting → Company Settings → Login Security-এ নির্ধারিত)। কিছুক্ষণ অপেক্ষা করুন, অথবা একজন প্রশাসককে Security → Users থেকে "Unlock Now" ক্লিক করতে বলুন।</w:t>
+            </w:r>
+          </w:p>
+        </w:tc>
+      </w:tr>
+      <w:tr>
+        <w:tc>
+          <w:tcPr>
+            <w:tcW w:type="dxa" w:w="3800"/>
+            <w:shd w:fill="FFFFFF" w:val="clear"/>
+          </w:tcPr>
+          <w:p>
+            <w:r>
+              <w:rPr>
+                <w:rFonts w:ascii="Nirmala UI" w:cs="Nirmala UI" w:eastAsia="Nirmala UI" w:hAnsi="Nirmala UI"/>
+                <w:b/>
+                <w:bCs/>
+                <w:sz w:val="20"/>
+                <w:szCs w:val="20"/>
+              </w:rPr>
+              <w:t xml:space="preserve">সঠিক পাসওয়ার্ড দিয়েও একটি নির্দিষ্ট নেটওয়ার্ক থেকে লগইন করতে পারছি না।</w:t>
+            </w:r>
+          </w:p>
+        </w:tc>
+        <w:tc>
+          <w:tcPr>
+            <w:tcW w:type="dxa" w:w="5700"/>
+            <w:shd w:fill="FFFFFF" w:val="clear"/>
+          </w:tcPr>
+          <w:p>
+            <w:r>
+              <w:rPr>
+                <w:rFonts w:ascii="Nirmala UI" w:cs="Nirmala UI" w:eastAsia="Nirmala UI" w:hAnsi="Nirmala UI"/>
+                <w:sz w:val="20"/>
+                <w:szCs w:val="20"/>
+              </w:rPr>
+              <w:t xml:space="preserve">Accounting → Company Settings → IP Whitelist-এ আইপি হোয়াইটলিস্ট চালু আছে কিনা যাচাই করুন — চালু থাকলে শুধু তালিকাভুক্ত আইপি থেকেই লগইন করা যায়। একজন প্রশাসককে আপনার বর্তমান আইপি যোগ করতে বলুন।</w:t>
+            </w:r>
+          </w:p>
+        </w:tc>
+      </w:tr>
+      <w:tr>
+        <w:tc>
+          <w:tcPr>
+            <w:tcW w:type="dxa" w:w="3800"/>
+            <w:shd w:fill="FFFFFF" w:val="clear"/>
+          </w:tcPr>
+          <w:p>
+            <w:r>
+              <w:rPr>
+                <w:rFonts w:ascii="Nirmala UI" w:cs="Nirmala UI" w:eastAsia="Nirmala UI" w:hAnsi="Nirmala UI"/>
+                <w:b/>
+                <w:bCs/>
+                <w:sz w:val="20"/>
+                <w:szCs w:val="20"/>
+              </w:rPr>
+              <w:t xml:space="preserve">সেলস রিসিট ও ইনভয়েসের মধ্যে পার্থক্য কী?</w:t>
+            </w:r>
+          </w:p>
+        </w:tc>
+        <w:tc>
+          <w:tcPr>
+            <w:tcW w:type="dxa" w:w="5700"/>
+            <w:shd w:fill="FFFFFF" w:val="clear"/>
+          </w:tcPr>
+          <w:p>
+            <w:r>
+              <w:rPr>
+                <w:rFonts w:ascii="Nirmala UI" w:cs="Nirmala UI" w:eastAsia="Nirmala UI" w:hAnsi="Nirmala UI"/>
+                <w:sz w:val="20"/>
+                <w:szCs w:val="20"/>
+              </w:rPr>
+              <w:t xml:space="preserve">সেলস রিসিট তখন ব্যবহার হয় যখন টাকা সাথে সাথেই পাওয়া যায় — এতে কোনো বকেয়া থাকে না। ইনভয়েস তখন ব্যবহার হয় যখন গ্রাহক পরে পরিশোধ করবেন — Payment রেকর্ড না হওয়া পর্যন্ত এটি গ্রাহকের বকেয়ায় থেকে যায়।</w:t>
+            </w:r>
+          </w:p>
+        </w:tc>
+      </w:tr>
     </w:tbl>
     <w:sectPr>
       <w:headerReference w:type="default" r:id="rId7"/>

</xml_diff>